<commit_message>
Updated the JS Q&A Word
</commit_message>
<xml_diff>
--- a/3rd-week/Practice questions/JavaScript Practice Questions Answers.docx
+++ b/3rd-week/Practice questions/JavaScript Practice Questions Answers.docx
@@ -5,6 +5,7 @@
     <w:p>
       <w:pPr>
         <w:pStyle w:val="Title"/>
+        <w:ind w:firstLine="720"/>
       </w:pPr>
       <w:r>
         <w:t>JavaScript Practice Questions Answers</w:t>
@@ -60,7 +61,7 @@
     <w:p>
       <w:r>
         <w:pict w14:anchorId="4951A2C3">
-          <v:rect id="_x0000_i1295" style="width:0;height:1.5pt" o:hralign="center" o:hrstd="t" o:hr="t" fillcolor="#a0a0a0" stroked="f"/>
+          <v:rect id="_x0000_i1025" style="width:0;height:1.5pt" o:hralign="center" o:hrstd="t" o:hr="t" fillcolor="#a0a0a0" stroked="f"/>
         </w:pict>
       </w:r>
     </w:p>
@@ -111,7 +112,7 @@
     <w:p>
       <w:r>
         <w:pict w14:anchorId="5BDDF3F2">
-          <v:rect id="_x0000_i1296" style="width:0;height:1.5pt" o:hralign="center" o:hrstd="t" o:hr="t" fillcolor="#a0a0a0" stroked="f"/>
+          <v:rect id="_x0000_i1026" style="width:0;height:1.5pt" o:hralign="center" o:hrstd="t" o:hr="t" fillcolor="#a0a0a0" stroked="f"/>
         </w:pict>
       </w:r>
     </w:p>
@@ -167,7 +168,7 @@
     <w:p>
       <w:r>
         <w:pict w14:anchorId="6CE47456">
-          <v:rect id="_x0000_i1297" style="width:0;height:1.5pt" o:hralign="center" o:hrstd="t" o:hr="t" fillcolor="#a0a0a0" stroked="f"/>
+          <v:rect id="_x0000_i1027" style="width:0;height:1.5pt" o:hralign="center" o:hrstd="t" o:hr="t" fillcolor="#a0a0a0" stroked="f"/>
         </w:pict>
       </w:r>
     </w:p>
@@ -207,7 +208,7 @@
     <w:p>
       <w:r>
         <w:pict w14:anchorId="134FF6E3">
-          <v:rect id="_x0000_i1298" style="width:0;height:1.5pt" o:hralign="center" o:hrstd="t" o:hr="t" fillcolor="#a0a0a0" stroked="f"/>
+          <v:rect id="_x0000_i1028" style="width:0;height:1.5pt" o:hralign="center" o:hrstd="t" o:hr="t" fillcolor="#a0a0a0" stroked="f"/>
         </w:pict>
       </w:r>
     </w:p>
@@ -247,7 +248,7 @@
     <w:p>
       <w:r>
         <w:pict w14:anchorId="7DBF2ED0">
-          <v:rect id="_x0000_i1299" style="width:0;height:1.5pt" o:hralign="center" o:hrstd="t" o:hr="t" fillcolor="#a0a0a0" stroked="f"/>
+          <v:rect id="_x0000_i1029" style="width:0;height:1.5pt" o:hralign="center" o:hrstd="t" o:hr="t" fillcolor="#a0a0a0" stroked="f"/>
         </w:pict>
       </w:r>
     </w:p>
@@ -325,7 +326,7 @@
     <w:p>
       <w:r>
         <w:pict w14:anchorId="2A73E54A">
-          <v:rect id="_x0000_i1300" style="width:0;height:1.5pt" o:hralign="center" o:hrstd="t" o:hr="t" fillcolor="#a0a0a0" stroked="f"/>
+          <v:rect id="_x0000_i1030" style="width:0;height:1.5pt" o:hralign="center" o:hrstd="t" o:hr="t" fillcolor="#a0a0a0" stroked="f"/>
         </w:pict>
       </w:r>
     </w:p>
@@ -365,7 +366,7 @@
     <w:p>
       <w:r>
         <w:pict w14:anchorId="3B3007F2">
-          <v:rect id="_x0000_i1301" style="width:0;height:1.5pt" o:hralign="center" o:hrstd="t" o:hr="t" fillcolor="#a0a0a0" stroked="f"/>
+          <v:rect id="_x0000_i1031" style="width:0;height:1.5pt" o:hralign="center" o:hrstd="t" o:hr="t" fillcolor="#a0a0a0" stroked="f"/>
         </w:pict>
       </w:r>
     </w:p>
@@ -426,7 +427,7 @@
     <w:p>
       <w:r>
         <w:pict w14:anchorId="3CADB45E">
-          <v:rect id="_x0000_i1302" style="width:0;height:1.5pt" o:hralign="center" o:hrstd="t" o:hr="t" fillcolor="#a0a0a0" stroked="f"/>
+          <v:rect id="_x0000_i1032" style="width:0;height:1.5pt" o:hralign="center" o:hrstd="t" o:hr="t" fillcolor="#a0a0a0" stroked="f"/>
         </w:pict>
       </w:r>
     </w:p>
@@ -466,7 +467,7 @@
     <w:p>
       <w:r>
         <w:pict w14:anchorId="6EED51BD">
-          <v:rect id="_x0000_i1303" style="width:0;height:1.5pt" o:hralign="center" o:hrstd="t" o:hr="t" fillcolor="#a0a0a0" stroked="f"/>
+          <v:rect id="_x0000_i1033" style="width:0;height:1.5pt" o:hralign="center" o:hrstd="t" o:hr="t" fillcolor="#a0a0a0" stroked="f"/>
         </w:pict>
       </w:r>
     </w:p>
@@ -506,7 +507,7 @@
     <w:p>
       <w:r>
         <w:pict w14:anchorId="2165A677">
-          <v:rect id="_x0000_i1304" style="width:0;height:1.5pt" o:hralign="center" o:hrstd="t" o:hr="t" fillcolor="#a0a0a0" stroked="f"/>
+          <v:rect id="_x0000_i1034" style="width:0;height:1.5pt" o:hralign="center" o:hrstd="t" o:hr="t" fillcolor="#a0a0a0" stroked="f"/>
         </w:pict>
       </w:r>
     </w:p>
@@ -546,7 +547,7 @@
     <w:p>
       <w:r>
         <w:pict w14:anchorId="53AFDECC">
-          <v:rect id="_x0000_i1305" style="width:0;height:1.5pt" o:hralign="center" o:hrstd="t" o:hr="t" fillcolor="#a0a0a0" stroked="f"/>
+          <v:rect id="_x0000_i1035" style="width:0;height:1.5pt" o:hralign="center" o:hrstd="t" o:hr="t" fillcolor="#a0a0a0" stroked="f"/>
         </w:pict>
       </w:r>
     </w:p>
@@ -586,7 +587,7 @@
     <w:p>
       <w:r>
         <w:pict w14:anchorId="1D032176">
-          <v:rect id="_x0000_i1306" style="width:0;height:1.5pt" o:hralign="center" o:hrstd="t" o:hr="t" fillcolor="#a0a0a0" stroked="f"/>
+          <v:rect id="_x0000_i1036" style="width:0;height:1.5pt" o:hralign="center" o:hrstd="t" o:hr="t" fillcolor="#a0a0a0" stroked="f"/>
         </w:pict>
       </w:r>
     </w:p>
@@ -627,7 +628,7 @@
     <w:p>
       <w:r>
         <w:pict w14:anchorId="1C276E2E">
-          <v:rect id="_x0000_i1307" style="width:0;height:1.5pt" o:hralign="center" o:hrstd="t" o:hr="t" fillcolor="#a0a0a0" stroked="f"/>
+          <v:rect id="_x0000_i1037" style="width:0;height:1.5pt" o:hralign="center" o:hrstd="t" o:hr="t" fillcolor="#a0a0a0" stroked="f"/>
         </w:pict>
       </w:r>
     </w:p>
@@ -675,7 +676,7 @@
     <w:p>
       <w:r>
         <w:pict w14:anchorId="2FBAAB09">
-          <v:rect id="_x0000_i1308" style="width:0;height:1.5pt" o:hralign="center" o:hrstd="t" o:hr="t" fillcolor="#a0a0a0" stroked="f"/>
+          <v:rect id="_x0000_i1038" style="width:0;height:1.5pt" o:hralign="center" o:hrstd="t" o:hr="t" fillcolor="#a0a0a0" stroked="f"/>
         </w:pict>
       </w:r>
     </w:p>
@@ -715,7 +716,7 @@
     <w:p>
       <w:r>
         <w:pict w14:anchorId="27404752">
-          <v:rect id="_x0000_i1309" style="width:0;height:1.5pt" o:hralign="center" o:hrstd="t" o:hr="t" fillcolor="#a0a0a0" stroked="f"/>
+          <v:rect id="_x0000_i1039" style="width:0;height:1.5pt" o:hralign="center" o:hrstd="t" o:hr="t" fillcolor="#a0a0a0" stroked="f"/>
         </w:pict>
       </w:r>
     </w:p>
@@ -759,7 +760,7 @@
     <w:p>
       <w:r>
         <w:pict w14:anchorId="08F3A683">
-          <v:rect id="_x0000_i1421" style="width:0;height:1.5pt" o:hralign="center" o:hrstd="t" o:hr="t" fillcolor="#a0a0a0" stroked="f"/>
+          <v:rect id="_x0000_i1040" style="width:0;height:1.5pt" o:hralign="center" o:hrstd="t" o:hr="t" fillcolor="#a0a0a0" stroked="f"/>
         </w:pict>
       </w:r>
     </w:p>
@@ -818,7 +819,7 @@
     <w:p>
       <w:r>
         <w:pict w14:anchorId="06479848">
-          <v:rect id="_x0000_i1422" style="width:0;height:1.5pt" o:hralign="center" o:hrstd="t" o:hr="t" fillcolor="#a0a0a0" stroked="f"/>
+          <v:rect id="_x0000_i1041" style="width:0;height:1.5pt" o:hralign="center" o:hrstd="t" o:hr="t" fillcolor="#a0a0a0" stroked="f"/>
         </w:pict>
       </w:r>
     </w:p>
@@ -847,7 +848,7 @@
     <w:p>
       <w:r>
         <w:pict w14:anchorId="03A9A779">
-          <v:rect id="_x0000_i1423" style="width:0;height:1.5pt" o:hralign="center" o:hrstd="t" o:hr="t" fillcolor="#a0a0a0" stroked="f"/>
+          <v:rect id="_x0000_i1042" style="width:0;height:1.5pt" o:hralign="center" o:hrstd="t" o:hr="t" fillcolor="#a0a0a0" stroked="f"/>
         </w:pict>
       </w:r>
     </w:p>
@@ -910,7 +911,7 @@
     <w:p>
       <w:r>
         <w:pict w14:anchorId="1E8A91F8">
-          <v:rect id="_x0000_i1424" style="width:0;height:1.5pt" o:hralign="center" o:hrstd="t" o:hr="t" fillcolor="#a0a0a0" stroked="f"/>
+          <v:rect id="_x0000_i1043" style="width:0;height:1.5pt" o:hralign="center" o:hrstd="t" o:hr="t" fillcolor="#a0a0a0" stroked="f"/>
         </w:pict>
       </w:r>
     </w:p>
@@ -939,7 +940,7 @@
     <w:p>
       <w:r>
         <w:pict w14:anchorId="450E95BC">
-          <v:rect id="_x0000_i1425" style="width:0;height:1.5pt" o:hralign="center" o:hrstd="t" o:hr="t" fillcolor="#a0a0a0" stroked="f"/>
+          <v:rect id="_x0000_i1044" style="width:0;height:1.5pt" o:hralign="center" o:hrstd="t" o:hr="t" fillcolor="#a0a0a0" stroked="f"/>
         </w:pict>
       </w:r>
     </w:p>
@@ -991,7 +992,7 @@
     <w:p>
       <w:r>
         <w:pict w14:anchorId="5B932171">
-          <v:rect id="_x0000_i1426" style="width:0;height:1.5pt" o:hralign="center" o:hrstd="t" o:hr="t" fillcolor="#a0a0a0" stroked="f"/>
+          <v:rect id="_x0000_i1045" style="width:0;height:1.5pt" o:hralign="center" o:hrstd="t" o:hr="t" fillcolor="#a0a0a0" stroked="f"/>
         </w:pict>
       </w:r>
     </w:p>
@@ -1031,7 +1032,7 @@
     <w:p>
       <w:r>
         <w:pict w14:anchorId="3676C537">
-          <v:rect id="_x0000_i1427" style="width:0;height:1.5pt" o:hralign="center" o:hrstd="t" o:hr="t" fillcolor="#a0a0a0" stroked="f"/>
+          <v:rect id="_x0000_i1046" style="width:0;height:1.5pt" o:hralign="center" o:hrstd="t" o:hr="t" fillcolor="#a0a0a0" stroked="f"/>
         </w:pict>
       </w:r>
     </w:p>
@@ -1086,7 +1087,7 @@
     <w:p>
       <w:r>
         <w:pict w14:anchorId="0578AEAB">
-          <v:rect id="_x0000_i1428" style="width:0;height:1.5pt" o:hralign="center" o:hrstd="t" o:hr="t" fillcolor="#a0a0a0" stroked="f"/>
+          <v:rect id="_x0000_i1047" style="width:0;height:1.5pt" o:hralign="center" o:hrstd="t" o:hr="t" fillcolor="#a0a0a0" stroked="f"/>
         </w:pict>
       </w:r>
     </w:p>
@@ -1126,7 +1127,7 @@
     <w:p>
       <w:r>
         <w:pict w14:anchorId="01D187E1">
-          <v:rect id="_x0000_i1429" style="width:0;height:1.5pt" o:hralign="center" o:hrstd="t" o:hr="t" fillcolor="#a0a0a0" stroked="f"/>
+          <v:rect id="_x0000_i1048" style="width:0;height:1.5pt" o:hralign="center" o:hrstd="t" o:hr="t" fillcolor="#a0a0a0" stroked="f"/>
         </w:pict>
       </w:r>
     </w:p>
@@ -1172,7 +1173,7 @@
     <w:p>
       <w:r>
         <w:pict w14:anchorId="5E56673A">
-          <v:rect id="_x0000_i1430" style="width:0;height:1.5pt" o:hralign="center" o:hrstd="t" o:hr="t" fillcolor="#a0a0a0" stroked="f"/>
+          <v:rect id="_x0000_i1049" style="width:0;height:1.5pt" o:hralign="center" o:hrstd="t" o:hr="t" fillcolor="#a0a0a0" stroked="f"/>
         </w:pict>
       </w:r>
     </w:p>
@@ -1235,7 +1236,7 @@
     <w:p>
       <w:r>
         <w:pict w14:anchorId="33C30785">
-          <v:rect id="_x0000_i1431" style="width:0;height:1.5pt" o:hralign="center" o:hrstd="t" o:hr="t" fillcolor="#a0a0a0" stroked="f"/>
+          <v:rect id="_x0000_i1050" style="width:0;height:1.5pt" o:hralign="center" o:hrstd="t" o:hr="t" fillcolor="#a0a0a0" stroked="f"/>
         </w:pict>
       </w:r>
     </w:p>
@@ -1298,7 +1299,7 @@
     <w:p>
       <w:r>
         <w:pict w14:anchorId="5C0455ED">
-          <v:rect id="_x0000_i1432" style="width:0;height:1.5pt" o:hralign="center" o:hrstd="t" o:hr="t" fillcolor="#a0a0a0" stroked="f"/>
+          <v:rect id="_x0000_i1051" style="width:0;height:1.5pt" o:hralign="center" o:hrstd="t" o:hr="t" fillcolor="#a0a0a0" stroked="f"/>
         </w:pict>
       </w:r>
     </w:p>
@@ -1373,7 +1374,7 @@
     <w:p>
       <w:r>
         <w:pict w14:anchorId="2D61526B">
-          <v:rect id="_x0000_i1433" style="width:0;height:1.5pt" o:hralign="center" o:hrstd="t" o:hr="t" fillcolor="#a0a0a0" stroked="f"/>
+          <v:rect id="_x0000_i1052" style="width:0;height:1.5pt" o:hralign="center" o:hrstd="t" o:hr="t" fillcolor="#a0a0a0" stroked="f"/>
         </w:pict>
       </w:r>
     </w:p>
@@ -1414,7 +1415,7 @@
       <w:r>
         <w:lastRenderedPageBreak/>
         <w:pict w14:anchorId="09A3AD3D">
-          <v:rect id="_x0000_i1434" style="width:0;height:1.5pt" o:hralign="center" o:hrstd="t" o:hr="t" fillcolor="#a0a0a0" stroked="f"/>
+          <v:rect id="_x0000_i1053" style="width:0;height:1.5pt" o:hralign="center" o:hrstd="t" o:hr="t" fillcolor="#a0a0a0" stroked="f"/>
         </w:pict>
       </w:r>
     </w:p>
@@ -1454,7 +1455,7 @@
     <w:p>
       <w:r>
         <w:pict w14:anchorId="6739B2E2">
-          <v:rect id="_x0000_i1435" style="width:0;height:1.5pt" o:hralign="center" o:hrstd="t" o:hr="t" fillcolor="#a0a0a0" stroked="f"/>
+          <v:rect id="_x0000_i1054" style="width:0;height:1.5pt" o:hralign="center" o:hrstd="t" o:hr="t" fillcolor="#a0a0a0" stroked="f"/>
         </w:pict>
       </w:r>
     </w:p>
@@ -1591,7 +1592,7 @@
     <w:p>
       <w:r>
         <w:pict w14:anchorId="2B906B02">
-          <v:rect id="_x0000_i1436" style="width:0;height:1.5pt" o:hralign="center" o:hrstd="t" o:hr="t" fillcolor="#a0a0a0" stroked="f"/>
+          <v:rect id="_x0000_i1055" style="width:0;height:1.5pt" o:hralign="center" o:hrstd="t" o:hr="t" fillcolor="#a0a0a0" stroked="f"/>
         </w:pict>
       </w:r>
     </w:p>
@@ -1659,7 +1660,7 @@
     <w:p>
       <w:r>
         <w:pict w14:anchorId="77E6121D">
-          <v:rect id="_x0000_i1531" style="width:0;height:1.5pt" o:hralign="center" o:hrstd="t" o:hr="t" fillcolor="#a0a0a0" stroked="f"/>
+          <v:rect id="_x0000_i1056" style="width:0;height:1.5pt" o:hralign="center" o:hrstd="t" o:hr="t" fillcolor="#a0a0a0" stroked="f"/>
         </w:pict>
       </w:r>
     </w:p>
@@ -1712,7 +1713,7 @@
     <w:p>
       <w:r>
         <w:pict w14:anchorId="5051D819">
-          <v:rect id="_x0000_i1532" style="width:0;height:1.5pt" o:hralign="center" o:hrstd="t" o:hr="t" fillcolor="#a0a0a0" stroked="f"/>
+          <v:rect id="_x0000_i1057" style="width:0;height:1.5pt" o:hralign="center" o:hrstd="t" o:hr="t" fillcolor="#a0a0a0" stroked="f"/>
         </w:pict>
       </w:r>
     </w:p>
@@ -1752,7 +1753,7 @@
     <w:p>
       <w:r>
         <w:pict w14:anchorId="6EDC10C5">
-          <v:rect id="_x0000_i1533" style="width:0;height:1.5pt" o:hralign="center" o:hrstd="t" o:hr="t" fillcolor="#a0a0a0" stroked="f"/>
+          <v:rect id="_x0000_i1058" style="width:0;height:1.5pt" o:hralign="center" o:hrstd="t" o:hr="t" fillcolor="#a0a0a0" stroked="f"/>
         </w:pict>
       </w:r>
     </w:p>
@@ -1792,7 +1793,7 @@
     <w:p>
       <w:r>
         <w:pict w14:anchorId="0B7C3FAB">
-          <v:rect id="_x0000_i1534" style="width:0;height:1.5pt" o:hralign="center" o:hrstd="t" o:hr="t" fillcolor="#a0a0a0" stroked="f"/>
+          <v:rect id="_x0000_i1059" style="width:0;height:1.5pt" o:hralign="center" o:hrstd="t" o:hr="t" fillcolor="#a0a0a0" stroked="f"/>
         </w:pict>
       </w:r>
     </w:p>
@@ -1920,7 +1921,7 @@
     <w:p>
       <w:r>
         <w:pict w14:anchorId="38A33E64">
-          <v:rect id="_x0000_i1535" style="width:0;height:1.5pt" o:hralign="center" o:hrstd="t" o:hr="t" fillcolor="#a0a0a0" stroked="f"/>
+          <v:rect id="_x0000_i1060" style="width:0;height:1.5pt" o:hralign="center" o:hrstd="t" o:hr="t" fillcolor="#a0a0a0" stroked="f"/>
         </w:pict>
       </w:r>
     </w:p>
@@ -1988,7 +1989,7 @@
     <w:p>
       <w:r>
         <w:pict w14:anchorId="699D4FCD">
-          <v:rect id="_x0000_i1536" style="width:0;height:1.5pt" o:hralign="center" o:hrstd="t" o:hr="t" fillcolor="#a0a0a0" stroked="f"/>
+          <v:rect id="_x0000_i1061" style="width:0;height:1.5pt" o:hralign="center" o:hrstd="t" o:hr="t" fillcolor="#a0a0a0" stroked="f"/>
         </w:pict>
       </w:r>
     </w:p>
@@ -2028,7 +2029,7 @@
     <w:p>
       <w:r>
         <w:pict w14:anchorId="530B64A2">
-          <v:rect id="_x0000_i1537" style="width:0;height:1.5pt" o:hralign="center" o:hrstd="t" o:hr="t" fillcolor="#a0a0a0" stroked="f"/>
+          <v:rect id="_x0000_i1062" style="width:0;height:1.5pt" o:hralign="center" o:hrstd="t" o:hr="t" fillcolor="#a0a0a0" stroked="f"/>
         </w:pict>
       </w:r>
     </w:p>
@@ -2103,7 +2104,7 @@
     <w:p>
       <w:r>
         <w:pict w14:anchorId="772069AC">
-          <v:rect id="_x0000_i1538" style="width:0;height:1.5pt" o:hralign="center" o:hrstd="t" o:hr="t" fillcolor="#a0a0a0" stroked="f"/>
+          <v:rect id="_x0000_i1063" style="width:0;height:1.5pt" o:hralign="center" o:hrstd="t" o:hr="t" fillcolor="#a0a0a0" stroked="f"/>
         </w:pict>
       </w:r>
     </w:p>
@@ -2171,7 +2172,7 @@
     <w:p>
       <w:r>
         <w:pict w14:anchorId="3182EEFC">
-          <v:rect id="_x0000_i1539" style="width:0;height:1.5pt" o:hralign="center" o:hrstd="t" o:hr="t" fillcolor="#a0a0a0" stroked="f"/>
+          <v:rect id="_x0000_i1064" style="width:0;height:1.5pt" o:hralign="center" o:hrstd="t" o:hr="t" fillcolor="#a0a0a0" stroked="f"/>
         </w:pict>
       </w:r>
     </w:p>
@@ -2211,7 +2212,7 @@
     <w:p>
       <w:r>
         <w:pict w14:anchorId="07170AFF">
-          <v:rect id="_x0000_i1540" style="width:0;height:1.5pt" o:hralign="center" o:hrstd="t" o:hr="t" fillcolor="#a0a0a0" stroked="f"/>
+          <v:rect id="_x0000_i1065" style="width:0;height:1.5pt" o:hralign="center" o:hrstd="t" o:hr="t" fillcolor="#a0a0a0" stroked="f"/>
         </w:pict>
       </w:r>
     </w:p>
@@ -2262,7 +2263,7 @@
     <w:p>
       <w:r>
         <w:pict w14:anchorId="1A0D9D20">
-          <v:rect id="_x0000_i1541" style="width:0;height:1.5pt" o:hralign="center" o:hrstd="t" o:hr="t" fillcolor="#a0a0a0" stroked="f"/>
+          <v:rect id="_x0000_i1066" style="width:0;height:1.5pt" o:hralign="center" o:hrstd="t" o:hr="t" fillcolor="#a0a0a0" stroked="f"/>
         </w:pict>
       </w:r>
     </w:p>
@@ -2325,7 +2326,7 @@
     <w:p>
       <w:r>
         <w:pict w14:anchorId="175188DA">
-          <v:rect id="_x0000_i1542" style="width:0;height:1.5pt" o:hralign="center" o:hrstd="t" o:hr="t" fillcolor="#a0a0a0" stroked="f"/>
+          <v:rect id="_x0000_i1067" style="width:0;height:1.5pt" o:hralign="center" o:hrstd="t" o:hr="t" fillcolor="#a0a0a0" stroked="f"/>
         </w:pict>
       </w:r>
     </w:p>
@@ -2476,7 +2477,7 @@
     <w:p>
       <w:r>
         <w:pict w14:anchorId="2DFBDDD3">
-          <v:rect id="_x0000_i1543" style="width:0;height:1.5pt" o:hralign="center" o:hrstd="t" o:hr="t" fillcolor="#a0a0a0" stroked="f"/>
+          <v:rect id="_x0000_i1068" style="width:0;height:1.5pt" o:hralign="center" o:hrstd="t" o:hr="t" fillcolor="#a0a0a0" stroked="f"/>
         </w:pict>
       </w:r>
     </w:p>
@@ -2536,7 +2537,7 @@
     <w:p>
       <w:r>
         <w:pict w14:anchorId="4BE8358C">
-          <v:rect id="_x0000_i1659" style="width:0;height:1.5pt" o:hralign="center" o:hrstd="t" o:hr="t" fillcolor="#a0a0a0" stroked="f"/>
+          <v:rect id="_x0000_i1069" style="width:0;height:1.5pt" o:hralign="center" o:hrstd="t" o:hr="t" fillcolor="#a0a0a0" stroked="f"/>
         </w:pict>
       </w:r>
     </w:p>
@@ -2584,7 +2585,7 @@
     <w:p>
       <w:r>
         <w:pict w14:anchorId="265B17F3">
-          <v:rect id="_x0000_i1660" style="width:0;height:1.5pt" o:hralign="center" o:hrstd="t" o:hr="t" fillcolor="#a0a0a0" stroked="f"/>
+          <v:rect id="_x0000_i1070" style="width:0;height:1.5pt" o:hralign="center" o:hrstd="t" o:hr="t" fillcolor="#a0a0a0" stroked="f"/>
         </w:pict>
       </w:r>
     </w:p>
@@ -2624,7 +2625,7 @@
     <w:p>
       <w:r>
         <w:pict w14:anchorId="0FB28D49">
-          <v:rect id="_x0000_i1661" style="width:0;height:1.5pt" o:hralign="center" o:hrstd="t" o:hr="t" fillcolor="#a0a0a0" stroked="f"/>
+          <v:rect id="_x0000_i1071" style="width:0;height:1.5pt" o:hralign="center" o:hrstd="t" o:hr="t" fillcolor="#a0a0a0" stroked="f"/>
         </w:pict>
       </w:r>
     </w:p>
@@ -2680,7 +2681,7 @@
     <w:p>
       <w:r>
         <w:pict w14:anchorId="4FE2F259">
-          <v:rect id="_x0000_i1662" style="width:0;height:1.5pt" o:hralign="center" o:hrstd="t" o:hr="t" fillcolor="#a0a0a0" stroked="f"/>
+          <v:rect id="_x0000_i1072" style="width:0;height:1.5pt" o:hralign="center" o:hrstd="t" o:hr="t" fillcolor="#a0a0a0" stroked="f"/>
         </w:pict>
       </w:r>
     </w:p>
@@ -2720,7 +2721,7 @@
     <w:p>
       <w:r>
         <w:pict w14:anchorId="50782F73">
-          <v:rect id="_x0000_i1663" style="width:0;height:1.5pt" o:hralign="center" o:hrstd="t" o:hr="t" fillcolor="#a0a0a0" stroked="f"/>
+          <v:rect id="_x0000_i1073" style="width:0;height:1.5pt" o:hralign="center" o:hrstd="t" o:hr="t" fillcolor="#a0a0a0" stroked="f"/>
         </w:pict>
       </w:r>
     </w:p>
@@ -2816,7 +2817,7 @@
     <w:p>
       <w:r>
         <w:pict w14:anchorId="2DC136EE">
-          <v:rect id="_x0000_i1664" style="width:0;height:1.5pt" o:hralign="center" o:hrstd="t" o:hr="t" fillcolor="#a0a0a0" stroked="f"/>
+          <v:rect id="_x0000_i1074" style="width:0;height:1.5pt" o:hralign="center" o:hrstd="t" o:hr="t" fillcolor="#a0a0a0" stroked="f"/>
         </w:pict>
       </w:r>
     </w:p>
@@ -2900,7 +2901,7 @@
     <w:p>
       <w:r>
         <w:pict w14:anchorId="68650E5E">
-          <v:rect id="_x0000_i1665" style="width:0;height:1.5pt" o:hralign="center" o:hrstd="t" o:hr="t" fillcolor="#a0a0a0" stroked="f"/>
+          <v:rect id="_x0000_i1075" style="width:0;height:1.5pt" o:hralign="center" o:hrstd="t" o:hr="t" fillcolor="#a0a0a0" stroked="f"/>
         </w:pict>
       </w:r>
     </w:p>
@@ -2940,7 +2941,7 @@
     <w:p>
       <w:r>
         <w:pict w14:anchorId="07E5180D">
-          <v:rect id="_x0000_i1666" style="width:0;height:1.5pt" o:hralign="center" o:hrstd="t" o:hr="t" fillcolor="#a0a0a0" stroked="f"/>
+          <v:rect id="_x0000_i1076" style="width:0;height:1.5pt" o:hralign="center" o:hrstd="t" o:hr="t" fillcolor="#a0a0a0" stroked="f"/>
         </w:pict>
       </w:r>
     </w:p>
@@ -2996,7 +2997,7 @@
     <w:p>
       <w:r>
         <w:pict w14:anchorId="7AD84D69">
-          <v:rect id="_x0000_i1667" style="width:0;height:1.5pt" o:hralign="center" o:hrstd="t" o:hr="t" fillcolor="#a0a0a0" stroked="f"/>
+          <v:rect id="_x0000_i1077" style="width:0;height:1.5pt" o:hralign="center" o:hrstd="t" o:hr="t" fillcolor="#a0a0a0" stroked="f"/>
         </w:pict>
       </w:r>
     </w:p>
@@ -3072,7 +3073,7 @@
     <w:p>
       <w:r>
         <w:pict w14:anchorId="571EB92B">
-          <v:rect id="_x0000_i1668" style="width:0;height:1.5pt" o:hralign="center" o:hrstd="t" o:hr="t" fillcolor="#a0a0a0" stroked="f"/>
+          <v:rect id="_x0000_i1078" style="width:0;height:1.5pt" o:hralign="center" o:hrstd="t" o:hr="t" fillcolor="#a0a0a0" stroked="f"/>
         </w:pict>
       </w:r>
     </w:p>
@@ -3113,7 +3114,7 @@
       <w:r>
         <w:lastRenderedPageBreak/>
         <w:pict w14:anchorId="50B2828F">
-          <v:rect id="_x0000_i1669" style="width:0;height:1.5pt" o:hralign="center" o:hrstd="t" o:hr="t" fillcolor="#a0a0a0" stroked="f"/>
+          <v:rect id="_x0000_i1079" style="width:0;height:1.5pt" o:hralign="center" o:hrstd="t" o:hr="t" fillcolor="#a0a0a0" stroked="f"/>
         </w:pict>
       </w:r>
     </w:p>
@@ -3192,7 +3193,7 @@
     <w:p>
       <w:r>
         <w:pict w14:anchorId="6B477CEA">
-          <v:rect id="_x0000_i1670" style="width:0;height:1.5pt" o:hralign="center" o:hrstd="t" o:hr="t" fillcolor="#a0a0a0" stroked="f"/>
+          <v:rect id="_x0000_i1080" style="width:0;height:1.5pt" o:hralign="center" o:hrstd="t" o:hr="t" fillcolor="#a0a0a0" stroked="f"/>
         </w:pict>
       </w:r>
     </w:p>
@@ -3260,7 +3261,7 @@
     <w:p>
       <w:r>
         <w:pict w14:anchorId="30901C76">
-          <v:rect id="_x0000_i1671" style="width:0;height:1.5pt" o:hralign="center" o:hrstd="t" o:hr="t" fillcolor="#a0a0a0" stroked="f"/>
+          <v:rect id="_x0000_i1081" style="width:0;height:1.5pt" o:hralign="center" o:hrstd="t" o:hr="t" fillcolor="#a0a0a0" stroked="f"/>
         </w:pict>
       </w:r>
     </w:p>
@@ -3328,7 +3329,7 @@
     <w:p>
       <w:r>
         <w:pict w14:anchorId="23A0B3A9">
-          <v:rect id="_x0000_i1672" style="width:0;height:1.5pt" o:hralign="center" o:hrstd="t" o:hr="t" fillcolor="#a0a0a0" stroked="f"/>
+          <v:rect id="_x0000_i1082" style="width:0;height:1.5pt" o:hralign="center" o:hrstd="t" o:hr="t" fillcolor="#a0a0a0" stroked="f"/>
         </w:pict>
       </w:r>
     </w:p>
@@ -3396,7 +3397,7 @@
     <w:p>
       <w:r>
         <w:pict w14:anchorId="6719173C">
-          <v:rect id="_x0000_i1673" style="width:0;height:1.5pt" o:hralign="center" o:hrstd="t" o:hr="t" fillcolor="#a0a0a0" stroked="f"/>
+          <v:rect id="_x0000_i1083" style="width:0;height:1.5pt" o:hralign="center" o:hrstd="t" o:hr="t" fillcolor="#a0a0a0" stroked="f"/>
         </w:pict>
       </w:r>
     </w:p>
@@ -3487,7 +3488,7 @@
     <w:p>
       <w:r>
         <w:pict w14:anchorId="489D4585">
-          <v:rect id="_x0000_i1674" style="width:0;height:1.5pt" o:hralign="center" o:hrstd="t" o:hr="t" fillcolor="#a0a0a0" stroked="f"/>
+          <v:rect id="_x0000_i1084" style="width:0;height:1.5pt" o:hralign="center" o:hrstd="t" o:hr="t" fillcolor="#a0a0a0" stroked="f"/>
         </w:pict>
       </w:r>
     </w:p>
@@ -3564,7 +3565,7 @@
     <w:p>
       <w:r>
         <w:pict w14:anchorId="5480C84C">
-          <v:rect id="_x0000_i1675" style="width:0;height:1.5pt" o:hralign="center" o:hrstd="t" o:hr="t" fillcolor="#a0a0a0" stroked="f"/>
+          <v:rect id="_x0000_i1085" style="width:0;height:1.5pt" o:hralign="center" o:hrstd="t" o:hr="t" fillcolor="#a0a0a0" stroked="f"/>
         </w:pict>
       </w:r>
     </w:p>
@@ -3608,7 +3609,7 @@
     <w:p>
       <w:r>
         <w:pict w14:anchorId="2F1B199B">
-          <v:rect id="_x0000_i1807" style="width:0;height:1.5pt" o:hralign="center" o:hrstd="t" o:hr="t" fillcolor="#a0a0a0" stroked="f"/>
+          <v:rect id="_x0000_i1086" style="width:0;height:1.5pt" o:hralign="center" o:hrstd="t" o:hr="t" fillcolor="#a0a0a0" stroked="f"/>
         </w:pict>
       </w:r>
     </w:p>
@@ -3648,7 +3649,7 @@
     <w:p>
       <w:r>
         <w:pict w14:anchorId="3DB20CFA">
-          <v:rect id="_x0000_i1808" style="width:0;height:1.5pt" o:hralign="center" o:hrstd="t" o:hr="t" fillcolor="#a0a0a0" stroked="f"/>
+          <v:rect id="_x0000_i1087" style="width:0;height:1.5pt" o:hralign="center" o:hrstd="t" o:hr="t" fillcolor="#a0a0a0" stroked="f"/>
         </w:pict>
       </w:r>
     </w:p>
@@ -3705,7 +3706,7 @@
     <w:p>
       <w:r>
         <w:pict w14:anchorId="72A8991A">
-          <v:rect id="_x0000_i1809" style="width:0;height:1.5pt" o:hralign="center" o:hrstd="t" o:hr="t" fillcolor="#a0a0a0" stroked="f"/>
+          <v:rect id="_x0000_i1088" style="width:0;height:1.5pt" o:hralign="center" o:hrstd="t" o:hr="t" fillcolor="#a0a0a0" stroked="f"/>
         </w:pict>
       </w:r>
     </w:p>
@@ -3791,7 +3792,7 @@
     <w:p>
       <w:r>
         <w:pict w14:anchorId="490662D2">
-          <v:rect id="_x0000_i1810" style="width:0;height:1.5pt" o:hralign="center" o:hrstd="t" o:hr="t" fillcolor="#a0a0a0" stroked="f"/>
+          <v:rect id="_x0000_i1089" style="width:0;height:1.5pt" o:hralign="center" o:hrstd="t" o:hr="t" fillcolor="#a0a0a0" stroked="f"/>
         </w:pict>
       </w:r>
     </w:p>
@@ -3877,7 +3878,7 @@
     <w:p>
       <w:r>
         <w:pict w14:anchorId="1509ED2E">
-          <v:rect id="_x0000_i1811" style="width:0;height:1.5pt" o:hralign="center" o:hrstd="t" o:hr="t" fillcolor="#a0a0a0" stroked="f"/>
+          <v:rect id="_x0000_i1090" style="width:0;height:1.5pt" o:hralign="center" o:hrstd="t" o:hr="t" fillcolor="#a0a0a0" stroked="f"/>
         </w:pict>
       </w:r>
     </w:p>
@@ -3917,7 +3918,7 @@
     <w:p>
       <w:r>
         <w:pict w14:anchorId="38DCBDDA">
-          <v:rect id="_x0000_i1812" style="width:0;height:1.5pt" o:hralign="center" o:hrstd="t" o:hr="t" fillcolor="#a0a0a0" stroked="f"/>
+          <v:rect id="_x0000_i1091" style="width:0;height:1.5pt" o:hralign="center" o:hrstd="t" o:hr="t" fillcolor="#a0a0a0" stroked="f"/>
         </w:pict>
       </w:r>
     </w:p>
@@ -3957,7 +3958,7 @@
     <w:p>
       <w:r>
         <w:pict w14:anchorId="076C1A42">
-          <v:rect id="_x0000_i1813" style="width:0;height:1.5pt" o:hralign="center" o:hrstd="t" o:hr="t" fillcolor="#a0a0a0" stroked="f"/>
+          <v:rect id="_x0000_i1092" style="width:0;height:1.5pt" o:hralign="center" o:hrstd="t" o:hr="t" fillcolor="#a0a0a0" stroked="f"/>
         </w:pict>
       </w:r>
     </w:p>
@@ -3995,7 +3996,7 @@
     <w:p>
       <w:r>
         <w:pict w14:anchorId="59380315">
-          <v:rect id="_x0000_i1814" style="width:0;height:1.5pt" o:hralign="center" o:hrstd="t" o:hr="t" fillcolor="#a0a0a0" stroked="f"/>
+          <v:rect id="_x0000_i1093" style="width:0;height:1.5pt" o:hralign="center" o:hrstd="t" o:hr="t" fillcolor="#a0a0a0" stroked="f"/>
         </w:pict>
       </w:r>
     </w:p>
@@ -4033,7 +4034,7 @@
     <w:p>
       <w:r>
         <w:pict w14:anchorId="54DB23CE">
-          <v:rect id="_x0000_i1815" style="width:0;height:1.5pt" o:hralign="center" o:hrstd="t" o:hr="t" fillcolor="#a0a0a0" stroked="f"/>
+          <v:rect id="_x0000_i1094" style="width:0;height:1.5pt" o:hralign="center" o:hrstd="t" o:hr="t" fillcolor="#a0a0a0" stroked="f"/>
         </w:pict>
       </w:r>
     </w:p>
@@ -4073,7 +4074,7 @@
     <w:p>
       <w:r>
         <w:pict w14:anchorId="75F9743E">
-          <v:rect id="_x0000_i1816" style="width:0;height:1.5pt" o:hralign="center" o:hrstd="t" o:hr="t" fillcolor="#a0a0a0" stroked="f"/>
+          <v:rect id="_x0000_i1095" style="width:0;height:1.5pt" o:hralign="center" o:hrstd="t" o:hr="t" fillcolor="#a0a0a0" stroked="f"/>
         </w:pict>
       </w:r>
     </w:p>
@@ -4114,7 +4115,7 @@
     <w:p>
       <w:r>
         <w:pict w14:anchorId="7DED69A1">
-          <v:rect id="_x0000_i1817" style="width:0;height:1.5pt" o:hralign="center" o:hrstd="t" o:hr="t" fillcolor="#a0a0a0" stroked="f"/>
+          <v:rect id="_x0000_i1096" style="width:0;height:1.5pt" o:hralign="center" o:hrstd="t" o:hr="t" fillcolor="#a0a0a0" stroked="f"/>
         </w:pict>
       </w:r>
     </w:p>
@@ -4177,7 +4178,7 @@
     <w:p>
       <w:r>
         <w:pict w14:anchorId="17FA301D">
-          <v:rect id="_x0000_i1818" style="width:0;height:1.5pt" o:hralign="center" o:hrstd="t" o:hr="t" fillcolor="#a0a0a0" stroked="f"/>
+          <v:rect id="_x0000_i1097" style="width:0;height:1.5pt" o:hralign="center" o:hrstd="t" o:hr="t" fillcolor="#a0a0a0" stroked="f"/>
         </w:pict>
       </w:r>
     </w:p>
@@ -4248,7 +4249,7 @@
     <w:p>
       <w:r>
         <w:pict w14:anchorId="74148E4A">
-          <v:rect id="_x0000_i1819" style="width:0;height:1.5pt" o:hralign="center" o:hrstd="t" o:hr="t" fillcolor="#a0a0a0" stroked="f"/>
+          <v:rect id="_x0000_i1098" style="width:0;height:1.5pt" o:hralign="center" o:hrstd="t" o:hr="t" fillcolor="#a0a0a0" stroked="f"/>
         </w:pict>
       </w:r>
     </w:p>
@@ -4301,7 +4302,7 @@
     <w:p>
       <w:r>
         <w:pict w14:anchorId="53A3B135">
-          <v:rect id="_x0000_i1820" style="width:0;height:1.5pt" o:hralign="center" o:hrstd="t" o:hr="t" fillcolor="#a0a0a0" stroked="f"/>
+          <v:rect id="_x0000_i1099" style="width:0;height:1.5pt" o:hralign="center" o:hrstd="t" o:hr="t" fillcolor="#a0a0a0" stroked="f"/>
         </w:pict>
       </w:r>
     </w:p>
@@ -4375,7 +4376,7 @@
     <w:p>
       <w:r>
         <w:pict w14:anchorId="49D20FB3">
-          <v:rect id="_x0000_i1821" style="width:0;height:1.5pt" o:hralign="center" o:hrstd="t" o:hr="t" fillcolor="#a0a0a0" stroked="f"/>
+          <v:rect id="_x0000_i1100" style="width:0;height:1.5pt" o:hralign="center" o:hrstd="t" o:hr="t" fillcolor="#a0a0a0" stroked="f"/>
         </w:pict>
       </w:r>
     </w:p>
@@ -4426,7 +4427,7 @@
     <w:p>
       <w:r>
         <w:pict w14:anchorId="1AB130E1">
-          <v:rect id="_x0000_i1822" style="width:0;height:1.5pt" o:hralign="center" o:hrstd="t" o:hr="t" fillcolor="#a0a0a0" stroked="f"/>
+          <v:rect id="_x0000_i1101" style="width:0;height:1.5pt" o:hralign="center" o:hrstd="t" o:hr="t" fillcolor="#a0a0a0" stroked="f"/>
         </w:pict>
       </w:r>
     </w:p>
@@ -4479,7 +4480,7 @@
     <w:p>
       <w:r>
         <w:pict w14:anchorId="1AACDBF7">
-          <v:rect id="_x0000_i1823" style="width:0;height:1.5pt" o:hralign="center" o:hrstd="t" o:hr="t" fillcolor="#a0a0a0" stroked="f"/>
+          <v:rect id="_x0000_i1102" style="width:0;height:1.5pt" o:hralign="center" o:hrstd="t" o:hr="t" fillcolor="#a0a0a0" stroked="f"/>
         </w:pict>
       </w:r>
     </w:p>
@@ -4557,7 +4558,7 @@
     <w:p>
       <w:r>
         <w:pict w14:anchorId="747F5D5B">
-          <v:rect id="_x0000_i1824" style="width:0;height:1.5pt" o:hralign="center" o:hrstd="t" o:hr="t" fillcolor="#a0a0a0" stroked="f"/>
+          <v:rect id="_x0000_i1103" style="width:0;height:1.5pt" o:hralign="center" o:hrstd="t" o:hr="t" fillcolor="#a0a0a0" stroked="f"/>
         </w:pict>
       </w:r>
     </w:p>
@@ -4618,7 +4619,7 @@
     <w:p>
       <w:r>
         <w:pict w14:anchorId="552D68F7">
-          <v:rect id="_x0000_i1825" style="width:0;height:1.5pt" o:hralign="center" o:hrstd="t" o:hr="t" fillcolor="#a0a0a0" stroked="f"/>
+          <v:rect id="_x0000_i1104" style="width:0;height:1.5pt" o:hralign="center" o:hrstd="t" o:hr="t" fillcolor="#a0a0a0" stroked="f"/>
         </w:pict>
       </w:r>
     </w:p>
@@ -4725,7 +4726,7 @@
     <w:p>
       <w:r>
         <w:pict w14:anchorId="2F907276">
-          <v:rect id="_x0000_i1881" style="width:0;height:1.5pt" o:hralign="center" o:hrstd="t" o:hr="t" fillcolor="#a0a0a0" stroked="f"/>
+          <v:rect id="_x0000_i1105" style="width:0;height:1.5pt" o:hralign="center" o:hrstd="t" o:hr="t" fillcolor="#a0a0a0" stroked="f"/>
         </w:pict>
       </w:r>
     </w:p>
@@ -4814,7 +4815,7 @@
     <w:p>
       <w:r>
         <w:pict w14:anchorId="5383F0AF">
-          <v:rect id="_x0000_i1882" style="width:0;height:1.5pt" o:hralign="center" o:hrstd="t" o:hr="t" fillcolor="#a0a0a0" stroked="f"/>
+          <v:rect id="_x0000_i1106" style="width:0;height:1.5pt" o:hralign="center" o:hrstd="t" o:hr="t" fillcolor="#a0a0a0" stroked="f"/>
         </w:pict>
       </w:r>
     </w:p>
@@ -4918,7 +4919,7 @@
     <w:p>
       <w:r>
         <w:pict w14:anchorId="07B53EEC">
-          <v:rect id="_x0000_i1883" style="width:0;height:1.5pt" o:hralign="center" o:hrstd="t" o:hr="t" fillcolor="#a0a0a0" stroked="f"/>
+          <v:rect id="_x0000_i1107" style="width:0;height:1.5pt" o:hralign="center" o:hrstd="t" o:hr="t" fillcolor="#a0a0a0" stroked="f"/>
         </w:pict>
       </w:r>
     </w:p>
@@ -5042,7 +5043,7 @@
     <w:p>
       <w:r>
         <w:pict w14:anchorId="4F3B92F0">
-          <v:rect id="_x0000_i1884" style="width:0;height:1.5pt" o:hralign="center" o:hrstd="t" o:hr="t" fillcolor="#a0a0a0" stroked="f"/>
+          <v:rect id="_x0000_i1108" style="width:0;height:1.5pt" o:hralign="center" o:hrstd="t" o:hr="t" fillcolor="#a0a0a0" stroked="f"/>
         </w:pict>
       </w:r>
     </w:p>
@@ -5150,7 +5151,7 @@
     <w:p>
       <w:r>
         <w:pict w14:anchorId="3B80EBA9">
-          <v:rect id="_x0000_i1885" style="width:0;height:1.5pt" o:hralign="center" o:hrstd="t" o:hr="t" fillcolor="#a0a0a0" stroked="f"/>
+          <v:rect id="_x0000_i1109" style="width:0;height:1.5pt" o:hralign="center" o:hrstd="t" o:hr="t" fillcolor="#a0a0a0" stroked="f"/>
         </w:pict>
       </w:r>
     </w:p>
@@ -5316,7 +5317,7 @@
       <w:r>
         <w:lastRenderedPageBreak/>
         <w:pict w14:anchorId="5BDD9081">
-          <v:rect id="_x0000_i1886" style="width:0;height:1.5pt" o:hralign="center" o:hrstd="t" o:hr="t" fillcolor="#a0a0a0" stroked="f"/>
+          <v:rect id="_x0000_i1110" style="width:0;height:1.5pt" o:hralign="center" o:hrstd="t" o:hr="t" fillcolor="#a0a0a0" stroked="f"/>
         </w:pict>
       </w:r>
     </w:p>
@@ -5472,7 +5473,7 @@
     <w:p>
       <w:r>
         <w:pict w14:anchorId="03793313">
-          <v:rect id="_x0000_i1941" style="width:0;height:1.5pt" o:hralign="center" o:hrstd="t" o:hr="t" fillcolor="#a0a0a0" stroked="f"/>
+          <v:rect id="_x0000_i1111" style="width:0;height:1.5pt" o:hralign="center" o:hrstd="t" o:hr="t" fillcolor="#a0a0a0" stroked="f"/>
         </w:pict>
       </w:r>
     </w:p>
@@ -5614,7 +5615,7 @@
     <w:p>
       <w:r>
         <w:pict w14:anchorId="5BA90D4F">
-          <v:rect id="_x0000_i1942" style="width:0;height:1.5pt" o:hralign="center" o:hrstd="t" o:hr="t" fillcolor="#a0a0a0" stroked="f"/>
+          <v:rect id="_x0000_i1112" style="width:0;height:1.5pt" o:hralign="center" o:hrstd="t" o:hr="t" fillcolor="#a0a0a0" stroked="f"/>
         </w:pict>
       </w:r>
     </w:p>
@@ -5826,7 +5827,7 @@
     <w:p>
       <w:r>
         <w:pict w14:anchorId="7F706C62">
-          <v:rect id="_x0000_i1943" style="width:0;height:1.5pt" o:hralign="center" o:hrstd="t" o:hr="t" fillcolor="#a0a0a0" stroked="f"/>
+          <v:rect id="_x0000_i1113" style="width:0;height:1.5pt" o:hralign="center" o:hrstd="t" o:hr="t" fillcolor="#a0a0a0" stroked="f"/>
         </w:pict>
       </w:r>
     </w:p>
@@ -6083,7 +6084,7 @@
     <w:p>
       <w:r>
         <w:pict w14:anchorId="16FADFE5">
-          <v:rect id="_x0000_i1944" style="width:0;height:1.5pt" o:hralign="center" o:hrstd="t" o:hr="t" fillcolor="#a0a0a0" stroked="f"/>
+          <v:rect id="_x0000_i1114" style="width:0;height:1.5pt" o:hralign="center" o:hrstd="t" o:hr="t" fillcolor="#a0a0a0" stroked="f"/>
         </w:pict>
       </w:r>
     </w:p>
@@ -6252,7 +6253,7 @@
     <w:p>
       <w:r>
         <w:pict w14:anchorId="316C0412">
-          <v:rect id="_x0000_i1945" style="width:0;height:1.5pt" o:hralign="center" o:hrstd="t" o:hr="t" fillcolor="#a0a0a0" stroked="f"/>
+          <v:rect id="_x0000_i1115" style="width:0;height:1.5pt" o:hralign="center" o:hrstd="t" o:hr="t" fillcolor="#a0a0a0" stroked="f"/>
         </w:pict>
       </w:r>
     </w:p>
@@ -6347,7 +6348,7 @@
     <w:p>
       <w:r>
         <w:pict w14:anchorId="17E50301">
-          <v:rect id="_x0000_i1946" style="width:0;height:1.5pt" o:hralign="center" o:hrstd="t" o:hr="t" fillcolor="#a0a0a0" stroked="f"/>
+          <v:rect id="_x0000_i1116" style="width:0;height:1.5pt" o:hralign="center" o:hrstd="t" o:hr="t" fillcolor="#a0a0a0" stroked="f"/>
         </w:pict>
       </w:r>
     </w:p>
@@ -6524,7 +6525,7 @@
     <w:p>
       <w:r>
         <w:pict w14:anchorId="47B0F662">
-          <v:rect id="_x0000_i1947" style="width:0;height:1.5pt" o:hralign="center" o:hrstd="t" o:hr="t" fillcolor="#a0a0a0" stroked="f"/>
+          <v:rect id="_x0000_i1117" style="width:0;height:1.5pt" o:hralign="center" o:hrstd="t" o:hr="t" fillcolor="#a0a0a0" stroked="f"/>
         </w:pict>
       </w:r>
     </w:p>
@@ -6654,7 +6655,7 @@
     <w:p>
       <w:r>
         <w:pict w14:anchorId="6AE8F034">
-          <v:rect id="_x0000_i1948" style="width:0;height:1.5pt" o:hralign="center" o:hrstd="t" o:hr="t" fillcolor="#a0a0a0" stroked="f"/>
+          <v:rect id="_x0000_i1118" style="width:0;height:1.5pt" o:hralign="center" o:hrstd="t" o:hr="t" fillcolor="#a0a0a0" stroked="f"/>
         </w:pict>
       </w:r>
     </w:p>
@@ -6860,6 +6861,12 @@
     <w:sectPr>
       <w:pgSz w:w="12240" w:h="15840"/>
       <w:pgMar w:top="720" w:right="720" w:bottom="720" w:left="720" w:header="720" w:footer="720" w:gutter="0"/>
+      <w:pgBorders w:offsetFrom="page">
+        <w:top w:val="single" w:sz="4" w:space="24" w:color="auto"/>
+        <w:left w:val="single" w:sz="4" w:space="24" w:color="auto"/>
+        <w:bottom w:val="single" w:sz="4" w:space="24" w:color="auto"/>
+        <w:right w:val="single" w:sz="4" w:space="24" w:color="auto"/>
+      </w:pgBorders>
       <w:cols w:space="720"/>
       <w:docGrid w:linePitch="360"/>
     </w:sectPr>
@@ -31044,6 +31051,7 @@
   <w:style w:type="character" w:default="1" w:styleId="DefaultParagraphFont">
     <w:name w:val="Default Paragraph Font"/>
     <w:uiPriority w:val="1"/>
+    <w:semiHidden/>
     <w:unhideWhenUsed/>
   </w:style>
   <w:style w:type="table" w:default="1" w:styleId="TableNormal">

</xml_diff>